<commit_message>
ADDED GROUP MEMBER WITH REG NUMBERS
</commit_message>
<xml_diff>
--- a/python group members.docx
+++ b/python group members.docx
@@ -31,6 +31,15 @@
         <w:t>Mwase</w:t>
       </w:r>
       <w:proofErr w:type="spellEnd"/>
+      <w:r>
+        <w:t xml:space="preserve"> </w:t>
+      </w:r>
+      <w:r>
+        <w:t>BIS/23/SS/</w:t>
+      </w:r>
+      <w:r>
+        <w:t>026</w:t>
+      </w:r>
     </w:p>
     <w:p>
       <w:pPr>
@@ -53,6 +62,17 @@
         <w:t>Chitanda</w:t>
       </w:r>
       <w:proofErr w:type="spellEnd"/>
+      <w:r>
+        <w:t xml:space="preserve"> BIS/21</w:t>
+      </w:r>
+      <w:r>
+        <w:t>/SS/</w:t>
+      </w:r>
+      <w:r>
+        <w:t>0</w:t>
+      </w:r>
+      <w:bookmarkStart w:id="0" w:name="_GoBack"/>
+      <w:bookmarkEnd w:id="0"/>
     </w:p>
     <w:p>
       <w:pPr>
@@ -69,9 +89,10 @@
       <w:r>
         <w:t>Sambani</w:t>
       </w:r>
-      <w:bookmarkStart w:id="0" w:name="_GoBack"/>
-      <w:bookmarkEnd w:id="0"/>
       <w:proofErr w:type="spellEnd"/>
+      <w:r>
+        <w:t xml:space="preserve"> BIS/23/SS/034</w:t>
+      </w:r>
     </w:p>
     <w:sectPr>
       <w:pgSz w:w="12240" w:h="15840"/>

</xml_diff>